<commit_message>
Guide aggiornate alla grafica del Design System Climosfera
Schermate nuove nella guida Word, testi allineati ai pulsanti Avanti/Indietro
e Precedente/Successiva, semafori descritti come quadratino con parola,
righe di import segnate come errore.

Co-Authored-By: Claude Opus 5.5 <noreply@anthropic.com>
Claude-Session: https://claude.ai/code/session_01Ep7VvpzhvfQKvcZuJhjmoX
</commit_message>
<xml_diff>
--- a/docs/pilota/Guida_Cruscotto_Commesse.docx
+++ b/docs/pilota/Guida_Cruscotto_Commesse.docx
@@ -2506,7 +2506,7 @@
           <w:sz w:val="20"/>
           <w:szCs w:val="20"/>
         </w:rPr>
-        <w:t xml:space="preserve">Accanto agli indicatori compare un semaforo: verde significa in linea, giallo attenzione, rosso critico. Le soglie di partenza sono: SPI e CPI verdi da 0,95 e gialli da 0,85; PPC verde dal 70% e giallo dal 55%; PCR verde dall'80% e giallo dal 60%. Sono valori di partenza che verranno tarati con i PM durante il pilota.</w:t>
+        <w:t xml:space="preserve">Accanto agli indicatori compare un semaforo: un piccolo quadrato colorato seguito sempre da una parola. Verde vuol dire in linea, giallo (tono ambra) attenzione, rosso critico, grigio n.d. quando mancano i dati. La parola basta da sola: il colore aiuta a trovare subito i punti critici. Le soglie di partenza sono: SPI e CPI verdi da 0,95 e gialli da 0,85; PPC verde dal 70% e giallo dal 55%; PCR verde dall'80% e giallo dal 60%. Sono valori di partenza che verranno tarati con i PM durante il pilota.</w:t>
       </w:r>
     </w:p>
     <w:p>
@@ -2650,7 +2650,7 @@
       <w:r>
         <w:drawing>
           <wp:inline distT="0" distB="0" distL="0" distR="0">
-            <wp:extent cx="5581650" cy="3314700"/>
+            <wp:extent cx="5581650" cy="1876425"/>
             <wp:effectExtent t="0" r="0" b="0" l="0"/>
             <wp:docPr id="1" name="" descr="" title=""/>
             <wp:cNvGraphicFramePr>
@@ -2675,7 +2675,7 @@
                   <pic:spPr bwMode="auto">
                     <a:xfrm>
                       <a:off x="0" y="0"/>
-                      <a:ext cx="5581650" cy="3314700"/>
+                      <a:ext cx="5581650" cy="1876425"/>
                     </a:xfrm>
                     <a:prstGeom prst="rect">
                       <a:avLst/>
@@ -2812,7 +2812,7 @@
           <w:sz w:val="20"/>
           <w:szCs w:val="20"/>
         </w:rPr>
-        <w:t xml:space="preserve">Edge su Windows: menu … poi App, poi Installa questo sito come app.</w:t>
+        <w:t xml:space="preserve">Edge su Windows: menu con i tre puntini, poi App, poi Installa questo sito come app.</w:t>
       </w:r>
     </w:p>
     <w:p>
@@ -2830,7 +2830,7 @@
           <w:sz w:val="20"/>
           <w:szCs w:val="20"/>
         </w:rPr>
-        <w:t xml:space="preserve">Chrome su Windows o Mac: menu ⋮ poi Trasmetti, salva e condividi, poi Installa pagina come app.</w:t>
+        <w:t xml:space="preserve">Chrome su Windows o Mac: menu con i tre puntini, poi Trasmetti, salva e condividi, poi Installa pagina come app.</w:t>
       </w:r>
     </w:p>
     <w:p>
@@ -3166,7 +3166,7 @@
           <w:sz w:val="20"/>
           <w:szCs w:val="20"/>
         </w:rPr>
-        <w:t xml:space="preserve">Elaborati: con Importa da Excel copia quattro colonne (codice, titolo, disciplina, budget in ore) e incollale; premi Anteprima, controlla le eventuali righe in rosso, poi Importa. In alternativa usa Nuovo elaborato per inserirne uno alla volta.</w:t>
+        <w:t xml:space="preserve">Elaborati: con Importa da Excel copia quattro colonne (codice, titolo, disciplina, budget in ore) e incollale; premi Anteprima, controlla le righe segnate come errore (finché ce n'è una non si importa nulla), poi Importa. In alternativa usa Nuovo elaborato per inserirne uno alla volta.</w:t>
       </w:r>
     </w:p>
     <w:p>
@@ -4412,7 +4412,7 @@
           <w:sz w:val="20"/>
           <w:szCs w:val="20"/>
         </w:rPr>
-        <w:t xml:space="preserve">Un elaborato avanza di uno stato alla volta, con le frecce sulla scheda o trascinandola. Non si saltano stati.</w:t>
+        <w:t xml:space="preserve">Un elaborato avanza di uno stato alla volta, con i pulsanti Avanti e Indietro sulla scheda oppure trascinandola nella colonna accanto. Non si saltano stati.</w:t>
       </w:r>
     </w:p>
     <w:p>
@@ -4496,7 +4496,7 @@
       <w:r>
         <w:drawing>
           <wp:inline distT="0" distB="0" distL="0" distR="0">
-            <wp:extent cx="5581650" cy="5362575"/>
+            <wp:extent cx="5581650" cy="5934075"/>
             <wp:effectExtent t="0" r="0" b="0" l="0"/>
             <wp:docPr id="8" name="" descr="" title=""/>
             <wp:cNvGraphicFramePr>
@@ -4521,7 +4521,7 @@
                   <pic:spPr bwMode="auto">
                     <a:xfrm>
                       <a:off x="0" y="0"/>
-                      <a:ext cx="5581650" cy="5362575"/>
+                      <a:ext cx="5581650" cy="5934075"/>
                     </a:xfrm>
                     <a:prstGeom prst="rect">
                       <a:avLst/>
@@ -4613,7 +4613,7 @@
           <w:sz w:val="20"/>
           <w:szCs w:val="20"/>
         </w:rPr>
-        <w:t xml:space="preserve">Al massimo 12 ore al giorno (valore di partenza).</w:t>
+        <w:t xml:space="preserve">Con Precedente e Successiva, sopra la griglia, ti sposti tra le settimane; Mostra sabato e domenica aggiunge il fine settimana.</w:t>
       </w:r>
     </w:p>
     <w:p>
@@ -4631,7 +4631,7 @@
           <w:sz w:val="20"/>
           <w:szCs w:val="20"/>
         </w:rPr>
-        <w:t xml:space="preserve">Una settimana si può correggere fino a 7 giorni dopo la sua fine; poi serve l'amministratore, che registra la correzione con il motivo.</w:t>
+        <w:t xml:space="preserve">Al massimo 12 ore al giorno (valore di partenza).</w:t>
       </w:r>
     </w:p>
     <w:p>
@@ -4649,7 +4649,7 @@
           <w:sz w:val="20"/>
           <w:szCs w:val="20"/>
         </w:rPr>
-        <w:t xml:space="preserve">Le ore diventano subito il costo effettivo della commessa: registrarle con puntualità rende affidabili i numeri di tutti.</w:t>
+        <w:t xml:space="preserve">Una settimana si può correggere fino a 7 giorni dopo la sua fine; poi serve l'amministratore, che registra la correzione con il motivo.</w:t>
       </w:r>
     </w:p>
     <w:p>
@@ -4667,6 +4667,24 @@
           <w:sz w:val="20"/>
           <w:szCs w:val="20"/>
         </w:rPr>
+        <w:t xml:space="preserve">Le ore diventano subito il costo effettivo della commessa: registrarle con puntualità rende affidabili i numeri di tutti.</w:t>
+      </w:r>
+    </w:p>
+    <w:p>
+      <w:pPr>
+        <w:pStyle w:val="ListParagraph"/>
+        <w:numPr>
+          <w:ilvl w:val="0"/>
+          <w:numId w:val="4"/>
+        </w:numPr>
+        <w:spacing w:after="0" w:before="0" w:line="360"/>
+      </w:pPr>
+      <w:r>
+        <w:rPr>
+          <w:rFonts w:ascii="Lora" w:cs="Lora" w:eastAsia="Lora" w:hAnsi="Lora"/>
+          <w:sz w:val="20"/>
+          <w:szCs w:val="20"/>
+        </w:rPr>
         <w:t xml:space="preserve">Nella scheda Ore della commessa il PM vede i totali per elaborato e le ore per persona, senza classifiche. La direzione vede solo i totali.</w:t>
       </w:r>
     </w:p>
@@ -4679,7 +4697,7 @@
       <w:r>
         <w:drawing>
           <wp:inline distT="0" distB="0" distL="0" distR="0">
-            <wp:extent cx="5581650" cy="3429000"/>
+            <wp:extent cx="5581650" cy="3448050"/>
             <wp:effectExtent t="0" r="0" b="0" l="0"/>
             <wp:docPr id="9" name="" descr="" title=""/>
             <wp:cNvGraphicFramePr>
@@ -4704,7 +4722,7 @@
                   <pic:spPr bwMode="auto">
                     <a:xfrm>
                       <a:off x="0" y="0"/>
-                      <a:ext cx="5581650" cy="3429000"/>
+                      <a:ext cx="5581650" cy="3448050"/>
                     </a:xfrm>
                     <a:prstGeom prst="rect">
                       <a:avLst/>

</xml_diff>